<commit_message>
Generate SWP text-first DOCX draft
</commit_message>
<xml_diff>
--- a/books/Speaking with PowerPoint/revision/control/presentations_style.docx
+++ b/books/Speaking with PowerPoint/revision/control/presentations_style.docx
@@ -23,6 +23,22 @@
     </w:p>
     <w:p>
       <w:pPr>
+        <w:pStyle w:val="FirstParagraph"/>
+      </w:pPr>
+      <w:r>
+        <w:t>First paragraph fallback used by Pandoc-generated DOCX XML.</w:t>
+      </w:r>
+    </w:p>
+    <w:p>
+      <w:pPr>
+        <w:pStyle w:val="BlockText"/>
+      </w:pPr>
+      <w:r>
+        <w:t>Block text fallback used by Pandoc-generated DOCX XML.</w:t>
+      </w:r>
+    </w:p>
+    <w:p>
+      <w:pPr>
         <w:pStyle w:val="PSBodyText"/>
       </w:pPr>
       <w:r>
@@ -35,6 +51,38 @@
       </w:pPr>
       <w:r>
         <w:t>Dense notes, compact explanations, and table body text.</w:t>
+      </w:r>
+    </w:p>
+    <w:p>
+      <w:pPr>
+        <w:pStyle w:val="Heading1"/>
+      </w:pPr>
+      <w:r>
+        <w:t>Unit 1: Presentation Purpose and Audience</w:t>
+      </w:r>
+    </w:p>
+    <w:p>
+      <w:pPr>
+        <w:pStyle w:val="Heading2"/>
+      </w:pPr>
+      <w:r>
+        <w:t>Core Skill: Make the Message Useful</w:t>
+      </w:r>
+    </w:p>
+    <w:p>
+      <w:pPr>
+        <w:pStyle w:val="Heading3"/>
+      </w:pPr>
+      <w:r>
+        <w:t>Practice Task 1: Audience Outcome Check</w:t>
+      </w:r>
+    </w:p>
+    <w:p>
+      <w:pPr>
+        <w:pStyle w:val="Heading4"/>
+      </w:pPr>
+      <w:r>
+        <w:t>Opening</w:t>
       </w:r>
     </w:p>
     <w:p>
@@ -1883,20 +1931,23 @@
     <w:qFormat/>
     <w:rsid w:val="00FC693F"/>
     <w:pPr>
-      <w:keepNext/>
       <w:keepLines/>
-      <w:spacing w:before="480" w:after="0"/>
+      <w:spacing w:before="0" w:after="320" w:line="240" w:lineRule="auto"/>
+      <w:jc w:val="left"/>
       <w:outlineLvl w:val="0"/>
+      <w:keepNext w:val="1"/>
+      <w:suppressAutoHyphens w:val="1"/>
+      <w:shd w:val="clear" w:color="auto" w:fill="3366A8"/>
       <w:widowControl w:val="1"/>
       <w:snapToGrid w:val="0"/>
     </w:pPr>
     <w:rPr>
-      <w:rFonts w:asciiTheme="majorHAnsi" w:eastAsiaTheme="majorEastAsia" w:hAnsiTheme="majorHAnsi" w:cstheme="majorBidi"/>
-      <w:b/>
+      <w:b w:val="0"/>
       <w:bCs/>
-      <w:color w:val="365F91" w:themeColor="accent1" w:themeShade="BF"/>
-      <w:sz w:val="28"/>
+      <w:color w:val="FFFFFF"/>
+      <w:sz w:val="56"/>
       <w:szCs w:val="28"/>
+      <w:rFonts w:ascii="Noto Sans Display SemiBold" w:hAnsi="Noto Sans Display SemiBold" w:cs="Noto Sans Display SemiBold" w:eastAsia="Noto Sans Display SemiBold"/>
       <w:lang w:val="en-US" w:eastAsia="en-US" w:bidi="en-US"/>
     </w:rPr>
   </w:style>
@@ -1910,20 +1961,25 @@
     <w:qFormat/>
     <w:rsid w:val="00FC693F"/>
     <w:pPr>
-      <w:keepNext/>
       <w:keepLines/>
-      <w:spacing w:before="200" w:after="0"/>
+      <w:spacing w:before="400" w:after="160" w:line="240" w:lineRule="auto"/>
+      <w:jc w:val="left"/>
       <w:outlineLvl w:val="1"/>
+      <w:keepNext w:val="1"/>
+      <w:suppressAutoHyphens w:val="1"/>
+      <w:pBdr>
+        <w:bottom w:val="single" w:sz="8" w:space="3" w:color="A24F71"/>
+      </w:pBdr>
       <w:widowControl w:val="1"/>
       <w:snapToGrid w:val="0"/>
     </w:pPr>
     <w:rPr>
-      <w:rFonts w:asciiTheme="majorHAnsi" w:eastAsiaTheme="majorEastAsia" w:hAnsiTheme="majorHAnsi" w:cstheme="majorBidi"/>
-      <w:b/>
+      <w:b w:val="0"/>
       <w:bCs/>
-      <w:color w:val="4F81BD" w:themeColor="accent1"/>
-      <w:sz w:val="26"/>
+      <w:color w:val="A24F71"/>
+      <w:sz w:val="32"/>
       <w:szCs w:val="26"/>
+      <w:rFonts w:ascii="Noto Sans SemiBold" w:hAnsi="Noto Sans SemiBold" w:cs="Noto Sans SemiBold" w:eastAsia="Noto Sans SemiBold"/>
       <w:lang w:val="en-US" w:eastAsia="en-US" w:bidi="en-US"/>
     </w:rPr>
   </w:style>
@@ -1937,18 +1993,21 @@
     <w:qFormat/>
     <w:rsid w:val="00FC693F"/>
     <w:pPr>
-      <w:keepNext/>
       <w:keepLines/>
-      <w:spacing w:before="200" w:after="0"/>
+      <w:spacing w:before="320" w:after="120" w:line="240" w:lineRule="auto"/>
+      <w:jc w:val="left"/>
       <w:outlineLvl w:val="2"/>
+      <w:keepNext w:val="1"/>
+      <w:suppressAutoHyphens w:val="1"/>
       <w:widowControl w:val="1"/>
       <w:snapToGrid w:val="0"/>
     </w:pPr>
     <w:rPr>
-      <w:rFonts w:asciiTheme="majorHAnsi" w:eastAsiaTheme="majorEastAsia" w:hAnsiTheme="majorHAnsi" w:cstheme="majorBidi"/>
-      <w:b/>
+      <w:b w:val="0"/>
       <w:bCs/>
-      <w:color w:val="4F81BD" w:themeColor="accent1"/>
+      <w:rFonts w:ascii="Noto Sans SemiBold" w:hAnsi="Noto Sans SemiBold" w:cs="Noto Sans SemiBold" w:eastAsia="Noto Sans SemiBold"/>
+      <w:color w:val="3366A8"/>
+      <w:sz w:val="27"/>
       <w:lang w:val="en-US" w:eastAsia="en-US" w:bidi="en-US"/>
     </w:rPr>
   </w:style>
@@ -1963,20 +2022,23 @@
     <w:qFormat/>
     <w:rsid w:val="00FC693F"/>
     <w:pPr>
-      <w:keepNext/>
       <w:keepLines/>
-      <w:spacing w:before="200" w:after="0"/>
+      <w:spacing w:before="240" w:after="80" w:line="240" w:lineRule="auto"/>
+      <w:jc w:val="left"/>
       <w:outlineLvl w:val="3"/>
+      <w:keepNext w:val="1"/>
+      <w:suppressAutoHyphens w:val="1"/>
       <w:widowControl w:val="1"/>
       <w:snapToGrid w:val="0"/>
     </w:pPr>
     <w:rPr>
-      <w:rFonts w:asciiTheme="majorHAnsi" w:eastAsiaTheme="majorEastAsia" w:hAnsiTheme="majorHAnsi" w:cstheme="majorBidi"/>
-      <w:b/>
+      <w:b w:val="0"/>
       <w:bCs/>
       <w:i/>
       <w:iCs/>
-      <w:color w:val="4F81BD" w:themeColor="accent1"/>
+      <w:rFonts w:ascii="Noto Sans SemiBold" w:hAnsi="Noto Sans SemiBold" w:cs="Noto Sans SemiBold" w:eastAsia="Noto Sans SemiBold"/>
+      <w:color w:val="C98F21"/>
+      <w:sz w:val="24"/>
       <w:lang w:val="en-US" w:eastAsia="en-US" w:bidi="en-US"/>
     </w:rPr>
   </w:style>
@@ -13868,6 +13930,48 @@
         <w:shd w:val="clear" w:color="auto" w:fill="FBCAA2" w:themeFill="accent6" w:themeFillTint="7F"/>
       </w:tcPr>
     </w:tblStylePr>
+  </w:style>
+  <w:style w:type="paragraph" w:customStyle="1" w:styleId="FirstParagraph">
+    <w:name w:val="FirstParagraph"/>
+    <w:basedOn w:val="Normal"/>
+    <w:pPr>
+      <w:spacing w:after="120" w:line="288" w:lineRule="auto"/>
+      <w:jc w:val="left"/>
+      <w:widowControl w:val="1"/>
+      <w:snapToGrid w:val="0"/>
+    </w:pPr>
+    <w:rPr>
+      <w:rFonts w:ascii="Noto Serif" w:hAnsi="Noto Serif" w:cs="Noto Serif" w:eastAsia="Noto Serif"/>
+      <w:color w:val="0B163A"/>
+      <w:sz w:val="22"/>
+      <w:lang w:val="en-US" w:eastAsia="en-US" w:bidi="en-US"/>
+    </w:rPr>
+  </w:style>
+  <w:style w:type="paragraph" w:customStyle="1" w:styleId="BlockText">
+    <w:name w:val="BlockText"/>
+    <w:basedOn w:val="Normal"/>
+    <w:pPr>
+      <w:spacing w:before="80" w:after="120" w:line="288" w:lineRule="auto"/>
+      <w:jc w:val="left"/>
+      <w:widowControl w:val="1"/>
+      <w:snapToGrid w:val="0"/>
+    </w:pPr>
+    <w:rPr>
+      <w:rFonts w:ascii="Noto Serif" w:hAnsi="Noto Serif" w:cs="Noto Serif" w:eastAsia="Noto Serif"/>
+      <w:color w:val="0B163A"/>
+      <w:sz w:val="21"/>
+      <w:lang w:val="en-US" w:eastAsia="en-US" w:bidi="en-US"/>
+    </w:rPr>
+  </w:style>
+  <w:style w:type="character" w:customStyle="1" w:styleId="Hyperlink">
+    <w:name w:val="Hyperlink"/>
+    <w:rPr>
+      <w:rFonts w:ascii="Noto Serif" w:hAnsi="Noto Serif" w:cs="Noto Serif" w:eastAsia="Noto Serif"/>
+      <w:color w:val="3366A8"/>
+      <w:sz w:val="22"/>
+      <w:u w:val="single"/>
+      <w:lang w:val="en-US" w:eastAsia="en-US" w:bidi="en-US"/>
+    </w:rPr>
   </w:style>
   <w:style w:type="paragraph" w:customStyle="1" w:styleId="PSBodyText">
     <w:name w:val="PS Body Text"/>

</xml_diff>

<commit_message>
updates to Speaking with PowerPoint, including first draft DOCX and draft style def
</commit_message>
<xml_diff>
--- a/books/Speaking with PowerPoint/revision/control/presentations_style.docx
+++ b/books/Speaking with PowerPoint/revision/control/presentations_style.docx
@@ -51,6 +51,22 @@
       </w:pPr>
       <w:r>
         <w:t>Dense notes, compact explanations, and table body text.</w:t>
+      </w:r>
+    </w:p>
+    <w:p>
+      <w:pPr>
+        <w:pStyle w:val="PSTableHeaderText"/>
+      </w:pPr>
+      <w:r>
+        <w:t>Table header text.</w:t>
+      </w:r>
+    </w:p>
+    <w:p>
+      <w:pPr>
+        <w:pStyle w:val="PSTableBodyText"/>
+      </w:pPr>
+      <w:r>
+        <w:t>Table body text.</w:t>
       </w:r>
     </w:p>
     <w:p>
@@ -672,9 +688,17 @@
         <w:tc>
           <w:tcPr>
             <w:tcW w:type="dxa" w:w="4110"/>
+            <w:shd w:val="clear" w:color="auto" w:fill="A24F71"/>
           </w:tcPr>
           <w:p>
+            <w:pPr>
+              <w:spacing w:after="0" w:line="240" w:lineRule="auto"/>
+              <w:jc w:val="left"/>
+            </w:pPr>
             <w:r>
+              <w:rPr>
+                <w:color w:val="FFFFFF"/>
+              </w:rPr>
               <w:t>Header 1</w:t>
             </w:r>
           </w:p>
@@ -682,9 +706,17 @@
         <w:tc>
           <w:tcPr>
             <w:tcW w:type="dxa" w:w="4110"/>
+            <w:shd w:val="clear" w:color="auto" w:fill="A24F71"/>
           </w:tcPr>
           <w:p>
+            <w:pPr>
+              <w:spacing w:after="0" w:line="240" w:lineRule="auto"/>
+              <w:jc w:val="left"/>
+            </w:pPr>
             <w:r>
+              <w:rPr>
+                <w:color w:val="FFFFFF"/>
+              </w:rPr>
               <w:t>Header 2</w:t>
             </w:r>
           </w:p>
@@ -732,9 +764,17 @@
         <w:tc>
           <w:tcPr>
             <w:tcW w:type="dxa" w:w="4110"/>
+            <w:shd w:val="clear" w:color="auto" w:fill="152B46"/>
           </w:tcPr>
           <w:p>
+            <w:pPr>
+              <w:spacing w:after="0" w:line="240" w:lineRule="auto"/>
+              <w:jc w:val="left"/>
+            </w:pPr>
             <w:r>
+              <w:rPr>
+                <w:color w:val="FFFFFF"/>
+              </w:rPr>
               <w:t>Header 1</w:t>
             </w:r>
           </w:p>
@@ -742,9 +782,17 @@
         <w:tc>
           <w:tcPr>
             <w:tcW w:type="dxa" w:w="4110"/>
+            <w:shd w:val="clear" w:color="auto" w:fill="152B46"/>
           </w:tcPr>
           <w:p>
+            <w:pPr>
+              <w:spacing w:after="0" w:line="240" w:lineRule="auto"/>
+              <w:jc w:val="left"/>
+            </w:pPr>
             <w:r>
+              <w:rPr>
+                <w:color w:val="FFFFFF"/>
+              </w:rPr>
               <w:t>Header 2</w:t>
             </w:r>
           </w:p>
@@ -792,9 +840,17 @@
         <w:tc>
           <w:tcPr>
             <w:tcW w:type="dxa" w:w="4110"/>
+            <w:shd w:val="clear" w:color="auto" w:fill="1F3D65"/>
           </w:tcPr>
           <w:p>
+            <w:pPr>
+              <w:spacing w:after="0" w:line="240" w:lineRule="auto"/>
+              <w:jc w:val="left"/>
+            </w:pPr>
             <w:r>
+              <w:rPr>
+                <w:color w:val="FFFFFF"/>
+              </w:rPr>
               <w:t>Header 1</w:t>
             </w:r>
           </w:p>
@@ -802,9 +858,17 @@
         <w:tc>
           <w:tcPr>
             <w:tcW w:type="dxa" w:w="4110"/>
+            <w:shd w:val="clear" w:color="auto" w:fill="1F3D65"/>
           </w:tcPr>
           <w:p>
+            <w:pPr>
+              <w:spacing w:after="0" w:line="240" w:lineRule="auto"/>
+              <w:jc w:val="left"/>
+            </w:pPr>
             <w:r>
+              <w:rPr>
+                <w:color w:val="FFFFFF"/>
+              </w:rPr>
               <w:t>Header 2</w:t>
             </w:r>
           </w:p>
@@ -852,9 +916,17 @@
         <w:tc>
           <w:tcPr>
             <w:tcW w:type="dxa" w:w="4110"/>
+            <w:shd w:val="clear" w:color="auto" w:fill="1F3D65"/>
           </w:tcPr>
           <w:p>
+            <w:pPr>
+              <w:spacing w:after="0" w:line="240" w:lineRule="auto"/>
+              <w:jc w:val="left"/>
+            </w:pPr>
             <w:r>
+              <w:rPr>
+                <w:color w:val="FFFFFF"/>
+              </w:rPr>
               <w:t>Header 1</w:t>
             </w:r>
           </w:p>
@@ -862,9 +934,17 @@
         <w:tc>
           <w:tcPr>
             <w:tcW w:type="dxa" w:w="4110"/>
+            <w:shd w:val="clear" w:color="auto" w:fill="1F3D65"/>
           </w:tcPr>
           <w:p>
+            <w:pPr>
+              <w:spacing w:after="0" w:line="240" w:lineRule="auto"/>
+              <w:jc w:val="left"/>
+            </w:pPr>
             <w:r>
+              <w:rPr>
+                <w:color w:val="FFFFFF"/>
+              </w:rPr>
               <w:t>Header 2</w:t>
             </w:r>
           </w:p>
@@ -912,9 +992,17 @@
         <w:tc>
           <w:tcPr>
             <w:tcW w:type="dxa" w:w="4110"/>
+            <w:shd w:val="clear" w:color="auto" w:fill="152B46"/>
           </w:tcPr>
           <w:p>
+            <w:pPr>
+              <w:spacing w:after="0" w:line="240" w:lineRule="auto"/>
+              <w:jc w:val="left"/>
+            </w:pPr>
             <w:r>
+              <w:rPr>
+                <w:color w:val="FFFFFF"/>
+              </w:rPr>
               <w:t>Header 1</w:t>
             </w:r>
           </w:p>
@@ -922,9 +1010,17 @@
         <w:tc>
           <w:tcPr>
             <w:tcW w:type="dxa" w:w="4110"/>
+            <w:shd w:val="clear" w:color="auto" w:fill="152B46"/>
           </w:tcPr>
           <w:p>
+            <w:pPr>
+              <w:spacing w:after="0" w:line="240" w:lineRule="auto"/>
+              <w:jc w:val="left"/>
+            </w:pPr>
             <w:r>
+              <w:rPr>
+                <w:color w:val="FFFFFF"/>
+              </w:rPr>
               <w:t>Header 2</w:t>
             </w:r>
           </w:p>
@@ -972,9 +1068,17 @@
         <w:tc>
           <w:tcPr>
             <w:tcW w:type="dxa" w:w="4110"/>
+            <w:shd w:val="clear" w:color="auto" w:fill="0B163A"/>
           </w:tcPr>
           <w:p>
+            <w:pPr>
+              <w:spacing w:after="0" w:line="240" w:lineRule="auto"/>
+              <w:jc w:val="left"/>
+            </w:pPr>
             <w:r>
+              <w:rPr>
+                <w:color w:val="FFFFFF"/>
+              </w:rPr>
               <w:t>Header 1</w:t>
             </w:r>
           </w:p>
@@ -982,9 +1086,17 @@
         <w:tc>
           <w:tcPr>
             <w:tcW w:type="dxa" w:w="4110"/>
+            <w:shd w:val="clear" w:color="auto" w:fill="0B163A"/>
           </w:tcPr>
           <w:p>
+            <w:pPr>
+              <w:spacing w:after="0" w:line="240" w:lineRule="auto"/>
+              <w:jc w:val="left"/>
+            </w:pPr>
             <w:r>
+              <w:rPr>
+                <w:color w:val="FFFFFF"/>
+              </w:rPr>
               <w:t>Header 2</w:t>
             </w:r>
           </w:p>
@@ -1032,9 +1144,17 @@
         <w:tc>
           <w:tcPr>
             <w:tcW w:type="dxa" w:w="4110"/>
+            <w:shd w:val="clear" w:color="auto" w:fill="3366A8"/>
           </w:tcPr>
           <w:p>
+            <w:pPr>
+              <w:spacing w:after="0" w:line="240" w:lineRule="auto"/>
+              <w:jc w:val="left"/>
+            </w:pPr>
             <w:r>
+              <w:rPr>
+                <w:color w:val="FFFFFF"/>
+              </w:rPr>
               <w:t>Header 1</w:t>
             </w:r>
           </w:p>
@@ -1042,9 +1162,17 @@
         <w:tc>
           <w:tcPr>
             <w:tcW w:type="dxa" w:w="4110"/>
+            <w:shd w:val="clear" w:color="auto" w:fill="3366A8"/>
           </w:tcPr>
           <w:p>
+            <w:pPr>
+              <w:spacing w:after="0" w:line="240" w:lineRule="auto"/>
+              <w:jc w:val="left"/>
+            </w:pPr>
             <w:r>
+              <w:rPr>
+                <w:color w:val="FFFFFF"/>
+              </w:rPr>
               <w:t>Header 2</w:t>
             </w:r>
           </w:p>
@@ -1092,9 +1220,17 @@
         <w:tc>
           <w:tcPr>
             <w:tcW w:type="dxa" w:w="4110"/>
+            <w:shd w:val="clear" w:color="auto" w:fill="3366A8"/>
           </w:tcPr>
           <w:p>
+            <w:pPr>
+              <w:spacing w:after="0" w:line="240" w:lineRule="auto"/>
+              <w:jc w:val="left"/>
+            </w:pPr>
             <w:r>
+              <w:rPr>
+                <w:color w:val="FFFFFF"/>
+              </w:rPr>
               <w:t>Header 1</w:t>
             </w:r>
           </w:p>
@@ -1102,9 +1238,17 @@
         <w:tc>
           <w:tcPr>
             <w:tcW w:type="dxa" w:w="4110"/>
+            <w:shd w:val="clear" w:color="auto" w:fill="3366A8"/>
           </w:tcPr>
           <w:p>
+            <w:pPr>
+              <w:spacing w:after="0" w:line="240" w:lineRule="auto"/>
+              <w:jc w:val="left"/>
+            </w:pPr>
             <w:r>
+              <w:rPr>
+                <w:color w:val="FFFFFF"/>
+              </w:rPr>
               <w:t>Header 2</w:t>
             </w:r>
           </w:p>
@@ -1152,9 +1296,17 @@
         <w:tc>
           <w:tcPr>
             <w:tcW w:type="dxa" w:w="4110"/>
+            <w:shd w:val="clear" w:color="auto" w:fill="152B46"/>
           </w:tcPr>
           <w:p>
+            <w:pPr>
+              <w:spacing w:after="0" w:line="240" w:lineRule="auto"/>
+              <w:jc w:val="left"/>
+            </w:pPr>
             <w:r>
+              <w:rPr>
+                <w:color w:val="FFFFFF"/>
+              </w:rPr>
               <w:t>Header 1</w:t>
             </w:r>
           </w:p>
@@ -1162,9 +1314,17 @@
         <w:tc>
           <w:tcPr>
             <w:tcW w:type="dxa" w:w="4110"/>
+            <w:shd w:val="clear" w:color="auto" w:fill="152B46"/>
           </w:tcPr>
           <w:p>
+            <w:pPr>
+              <w:spacing w:after="0" w:line="240" w:lineRule="auto"/>
+              <w:jc w:val="left"/>
+            </w:pPr>
             <w:r>
+              <w:rPr>
+                <w:color w:val="FFFFFF"/>
+              </w:rPr>
               <w:t>Header 2</w:t>
             </w:r>
           </w:p>
@@ -1212,9 +1372,17 @@
         <w:tc>
           <w:tcPr>
             <w:tcW w:type="dxa" w:w="4110"/>
+            <w:shd w:val="clear" w:color="auto" w:fill="3366A8"/>
           </w:tcPr>
           <w:p>
+            <w:pPr>
+              <w:spacing w:after="0" w:line="240" w:lineRule="auto"/>
+              <w:jc w:val="left"/>
+            </w:pPr>
             <w:r>
+              <w:rPr>
+                <w:color w:val="FFFFFF"/>
+              </w:rPr>
               <w:t>Header 1</w:t>
             </w:r>
           </w:p>
@@ -1222,9 +1390,17 @@
         <w:tc>
           <w:tcPr>
             <w:tcW w:type="dxa" w:w="4110"/>
+            <w:shd w:val="clear" w:color="auto" w:fill="3366A8"/>
           </w:tcPr>
           <w:p>
+            <w:pPr>
+              <w:spacing w:after="0" w:line="240" w:lineRule="auto"/>
+              <w:jc w:val="left"/>
+            </w:pPr>
             <w:r>
+              <w:rPr>
+                <w:color w:val="FFFFFF"/>
+              </w:rPr>
               <w:t>Header 2</w:t>
             </w:r>
           </w:p>
@@ -1272,9 +1448,17 @@
         <w:tc>
           <w:tcPr>
             <w:tcW w:type="dxa" w:w="4110"/>
+            <w:shd w:val="clear" w:color="auto" w:fill="A24F71"/>
           </w:tcPr>
           <w:p>
+            <w:pPr>
+              <w:spacing w:after="0" w:line="240" w:lineRule="auto"/>
+              <w:jc w:val="left"/>
+            </w:pPr>
             <w:r>
+              <w:rPr>
+                <w:color w:val="FFFFFF"/>
+              </w:rPr>
               <w:t>Header 1</w:t>
             </w:r>
           </w:p>
@@ -1282,9 +1466,17 @@
         <w:tc>
           <w:tcPr>
             <w:tcW w:type="dxa" w:w="4110"/>
+            <w:shd w:val="clear" w:color="auto" w:fill="A24F71"/>
           </w:tcPr>
           <w:p>
+            <w:pPr>
+              <w:spacing w:after="0" w:line="240" w:lineRule="auto"/>
+              <w:jc w:val="left"/>
+            </w:pPr>
             <w:r>
+              <w:rPr>
+                <w:color w:val="FFFFFF"/>
+              </w:rPr>
               <w:t>Header 2</w:t>
             </w:r>
           </w:p>
@@ -1332,9 +1524,17 @@
         <w:tc>
           <w:tcPr>
             <w:tcW w:type="dxa" w:w="4110"/>
+            <w:shd w:val="clear" w:color="auto" w:fill="152B46"/>
           </w:tcPr>
           <w:p>
+            <w:pPr>
+              <w:spacing w:after="0" w:line="240" w:lineRule="auto"/>
+              <w:jc w:val="left"/>
+            </w:pPr>
             <w:r>
+              <w:rPr>
+                <w:color w:val="FFFFFF"/>
+              </w:rPr>
               <w:t>Header 1</w:t>
             </w:r>
           </w:p>
@@ -1342,9 +1542,17 @@
         <w:tc>
           <w:tcPr>
             <w:tcW w:type="dxa" w:w="4110"/>
+            <w:shd w:val="clear" w:color="auto" w:fill="152B46"/>
           </w:tcPr>
           <w:p>
+            <w:pPr>
+              <w:spacing w:after="0" w:line="240" w:lineRule="auto"/>
+              <w:jc w:val="left"/>
+            </w:pPr>
             <w:r>
+              <w:rPr>
+                <w:color w:val="FFFFFF"/>
+              </w:rPr>
               <w:t>Header 2</w:t>
             </w:r>
           </w:p>
@@ -1392,9 +1600,17 @@
         <w:tc>
           <w:tcPr>
             <w:tcW w:type="dxa" w:w="4110"/>
+            <w:shd w:val="clear" w:color="auto" w:fill="A24F71"/>
           </w:tcPr>
           <w:p>
+            <w:pPr>
+              <w:spacing w:after="0" w:line="240" w:lineRule="auto"/>
+              <w:jc w:val="left"/>
+            </w:pPr>
             <w:r>
+              <w:rPr>
+                <w:color w:val="FFFFFF"/>
+              </w:rPr>
               <w:t>Header 1</w:t>
             </w:r>
           </w:p>
@@ -1402,9 +1618,17 @@
         <w:tc>
           <w:tcPr>
             <w:tcW w:type="dxa" w:w="4110"/>
+            <w:shd w:val="clear" w:color="auto" w:fill="A24F71"/>
           </w:tcPr>
           <w:p>
+            <w:pPr>
+              <w:spacing w:after="0" w:line="240" w:lineRule="auto"/>
+              <w:jc w:val="left"/>
+            </w:pPr>
             <w:r>
+              <w:rPr>
+                <w:color w:val="FFFFFF"/>
+              </w:rPr>
               <w:t>Header 2</w:t>
             </w:r>
           </w:p>
@@ -1438,7 +1662,7 @@
       <w:footerReference w:type="default" r:id="rId10"/>
       <w:footerReference w:type="even" r:id="rId11"/>
       <w:pgSz w:w="11906" w:h="16838"/>
-      <w:pgMar w:top="1134" w:right="1417" w:bottom="1417" w:left="2268" w:header="720" w:footer="720" w:gutter="0"/>
+      <w:pgMar w:top="1417" w:right="1417" w:bottom="1134" w:left="2268" w:header="567" w:footer="454" w:gutter="0"/>
       <w:cols w:space="720"/>
       <w:docGrid w:linePitch="360"/>
     </w:sectPr>
@@ -1465,7 +1689,7 @@
   <w:p>
     <w:pPr>
       <w:pStyle w:val="PSPageNumber"/>
-      <w:jc w:val="right"/>
+      <w:jc w:val="left"/>
     </w:pPr>
     <w:r>
       <w:fldSimple w:instr="PAGE"/>
@@ -1945,7 +2169,7 @@
       <w:b w:val="0"/>
       <w:bCs/>
       <w:color w:val="FFFFFF"/>
-      <w:sz w:val="56"/>
+      <w:sz w:val="48"/>
       <w:szCs w:val="28"/>
       <w:rFonts w:ascii="Noto Sans Display SemiBold" w:hAnsi="Noto Sans Display SemiBold" w:cs="Noto Sans Display SemiBold" w:eastAsia="Noto Sans Display SemiBold"/>
       <w:lang w:val="en-US" w:eastAsia="en-US" w:bidi="en-US"/>
@@ -14005,6 +14229,40 @@
       <w:lang w:val="en-US" w:eastAsia="en-US" w:bidi="en-US"/>
     </w:rPr>
   </w:style>
+  <w:style w:type="paragraph" w:customStyle="1" w:styleId="PSTableHeaderText">
+    <w:name w:val="PS Table Header Text"/>
+    <w:basedOn w:val="Normal"/>
+    <w:pPr>
+      <w:spacing w:after="0" w:line="240" w:lineRule="auto"/>
+      <w:suppressAutoHyphens w:val="1"/>
+      <w:jc w:val="left"/>
+      <w:widowControl w:val="1"/>
+      <w:snapToGrid w:val="0"/>
+    </w:pPr>
+    <w:rPr>
+      <w:rFonts w:ascii="Noto Sans SemiBold" w:hAnsi="Noto Sans SemiBold" w:cs="Noto Sans SemiBold" w:eastAsia="Noto Sans SemiBold"/>
+      <w:color w:val="FFFFFF"/>
+      <w:sz w:val="20"/>
+      <w:lang w:val="en-US" w:eastAsia="en-US" w:bidi="en-US"/>
+    </w:rPr>
+  </w:style>
+  <w:style w:type="paragraph" w:customStyle="1" w:styleId="PSTableBodyText">
+    <w:name w:val="PS Table Body Text"/>
+    <w:basedOn w:val="Normal"/>
+    <w:pPr>
+      <w:spacing w:after="0" w:line="264" w:lineRule="auto"/>
+      <w:suppressAutoHyphens w:val="1"/>
+      <w:jc w:val="left"/>
+      <w:widowControl w:val="1"/>
+      <w:snapToGrid w:val="0"/>
+    </w:pPr>
+    <w:rPr>
+      <w:rFonts w:ascii="Noto Sans" w:hAnsi="Noto Sans" w:cs="Noto Sans" w:eastAsia="Noto Sans"/>
+      <w:color w:val="0B163A"/>
+      <w:sz w:val="20"/>
+      <w:lang w:val="en-US" w:eastAsia="en-US" w:bidi="en-US"/>
+    </w:rPr>
+  </w:style>
   <w:style w:type="paragraph" w:customStyle="1" w:styleId="PSHeading1">
     <w:name w:val="PS Heading 1"/>
     <w:basedOn w:val="Heading1"/>
@@ -14021,7 +14279,7 @@
       <w:rFonts w:ascii="Noto Sans Display SemiBold" w:hAnsi="Noto Sans Display SemiBold" w:cs="Noto Sans Display SemiBold" w:eastAsia="Noto Sans Display SemiBold"/>
       <w:b w:val="0"/>
       <w:color w:val="FFFFFF"/>
-      <w:sz w:val="56"/>
+      <w:sz w:val="48"/>
       <w:lang w:val="en-US" w:eastAsia="en-US" w:bidi="en-US"/>
     </w:rPr>
   </w:style>
@@ -14367,7 +14625,7 @@
       <w:rFonts w:ascii="Noto Sans Display SemiBold" w:hAnsi="Noto Sans Display SemiBold" w:cs="Noto Sans Display SemiBold" w:eastAsia="Noto Sans Display SemiBold"/>
       <w:b w:val="0"/>
       <w:color w:val="FFFFFF"/>
-      <w:sz w:val="56"/>
+      <w:sz w:val="48"/>
       <w:lang w:val="en-US" w:eastAsia="en-US" w:bidi="en-US"/>
     </w:rPr>
   </w:style>

</xml_diff>